<commit_message>
Resolve accessibility warnings in legacy templates
</commit_message>
<xml_diff>
--- a/docassemble/ALToolbox/data/templates/table-addendum.docx
+++ b/docassemble/ALToolbox/data/templates/table-addendum.docx
@@ -4,7 +4,7 @@
   <w:body>
     <w:p>
       <w:pPr>
-        <w:pStyle w:val="Heading2"/>
+        <w:pStyle w:val="Heading1"/>
         <w:spacing w:before="200" w:after="120"/>
         <w:jc w:val="center"/>
         <w:rPr/>
@@ -340,7 +340,7 @@
             <w:r>
               <w:rPr>
                 <w:rStyle w:val="SourceText"/>
-                <w:color w:val="3FAF46"/>
+                <w:color w:val="006100"/>
                 <w:sz w:val="20"/>
                 <w:szCs w:val="20"/>
               </w:rPr>
@@ -349,7 +349,7 @@
             <w:r>
               <w:rPr>
                 <w:rStyle w:val="SourceText"/>
-                <w:color w:val="3FAF46"/>
+                <w:color w:val="006100"/>
                 <w:sz w:val="20"/>
                 <w:szCs w:val="20"/>
                 <w:lang w:val="en-US" w:eastAsia="zh-CN" w:bidi="hi-IN"/>
@@ -359,7 +359,7 @@
             <w:r>
               <w:rPr>
                 <w:rStyle w:val="SourceText"/>
-                <w:color w:val="3FAF46"/>
+                <w:color w:val="006100"/>
                 <w:sz w:val="20"/>
                 <w:szCs w:val="20"/>
               </w:rPr>
@@ -413,7 +413,7 @@
             <w:r>
               <w:rPr>
                 <w:rStyle w:val="SourceText"/>
-                <w:color w:val="3FAF46"/>
+                <w:color w:val="006100"/>
                 <w:sz w:val="20"/>
                 <w:szCs w:val="20"/>
               </w:rPr>
@@ -440,7 +440,7 @@
             <w:r>
               <w:rPr>
                 <w:rStyle w:val="SourceText"/>
-                <w:color w:val="3FAF46"/>
+                <w:color w:val="006100"/>
                 <w:kern w:val="2"/>
                 <w:sz w:val="20"/>
                 <w:szCs w:val="20"/>
@@ -529,7 +529,7 @@
                 <w:rStyle w:val="SourceText"/>
                 <w:bCs w:val="false"/>
                 <w:iCs w:val="false"/>
-                <w:color w:val="3FAF46"/>
+                <w:color w:val="006100"/>
                 <w:sz w:val="20"/>
                 <w:szCs w:val="20"/>
               </w:rPr>
@@ -541,7 +541,7 @@
                 <w:rFonts w:eastAsia="NSimSun" w:cs="Liberation Mono"/>
                 <w:bCs w:val="false"/>
                 <w:iCs w:val="false"/>
-                <w:color w:val="3FAF46"/>
+                <w:color w:val="006100"/>
                 <w:kern w:val="2"/>
                 <w:sz w:val="20"/>
                 <w:szCs w:val="20"/>
@@ -554,7 +554,7 @@
                 <w:rStyle w:val="SourceText"/>
                 <w:bCs w:val="false"/>
                 <w:iCs w:val="false"/>
-                <w:color w:val="3FAF46"/>
+                <w:color w:val="006100"/>
                 <w:sz w:val="20"/>
                 <w:szCs w:val="20"/>
               </w:rPr>
@@ -611,7 +611,7 @@
             <w:r>
               <w:rPr>
                 <w:rStyle w:val="SourceText"/>
-                <w:color w:val="3FAF46"/>
+                <w:color w:val="006100"/>
                 <w:kern w:val="2"/>
                 <w:sz w:val="20"/>
                 <w:szCs w:val="20"/>
@@ -672,184 +672,6 @@
           <w:rStyle w:val="SourceText"/>
         </w:rPr>
         <w:t xml:space="preserve">  </w:t>
-      </w:r>
-    </w:p>
-    <w:p>
-      <w:pPr>
-        <w:pStyle w:val="PreformattedText"/>
-        <w:bidi w:val="0"/>
-        <w:spacing w:before="0" w:after="0"/>
-        <w:jc w:val="left"/>
-        <w:rPr>
-          <w:rStyle w:val="SourceText"/>
-          <w:sz w:val="20"/>
-          <w:szCs w:val="20"/>
-        </w:rPr>
-      </w:pPr>
-      <w:r>
-        <w:rPr>
-          <w:sz w:val="20"/>
-          <w:szCs w:val="20"/>
-        </w:rPr>
-      </w:r>
-    </w:p>
-    <w:p>
-      <w:pPr>
-        <w:pStyle w:val="PreformattedText"/>
-        <w:bidi w:val="0"/>
-        <w:spacing w:before="0" w:after="0"/>
-        <w:jc w:val="left"/>
-        <w:rPr>
-          <w:rStyle w:val="SourceText"/>
-          <w:rFonts w:ascii="sans-serif" w:hAnsi="sans-serif"/>
-          <w:color w:val="3FAF46"/>
-          <w:kern w:val="2"/>
-          <w:sz w:val="20"/>
-          <w:szCs w:val="20"/>
-          <w:lang w:val="en-US" w:eastAsia="zh-CN" w:bidi="hi-IN"/>
-        </w:rPr>
-      </w:pPr>
-      <w:r>
-        <w:rPr/>
-      </w:r>
-    </w:p>
-    <w:p>
-      <w:pPr>
-        <w:pStyle w:val="PreformattedText"/>
-        <w:bidi w:val="0"/>
-        <w:spacing w:before="0" w:after="0"/>
-        <w:jc w:val="left"/>
-        <w:rPr>
-          <w:rStyle w:val="SourceText"/>
-          <w:color w:val="auto"/>
-          <w:kern w:val="2"/>
-          <w:sz w:val="20"/>
-          <w:szCs w:val="20"/>
-        </w:rPr>
-      </w:pPr>
-      <w:r>
-        <w:rPr>
-          <w:color w:val="auto"/>
-          <w:kern w:val="2"/>
-          <w:sz w:val="20"/>
-          <w:szCs w:val="20"/>
-        </w:rPr>
-      </w:r>
-    </w:p>
-    <w:p>
-      <w:pPr>
-        <w:pStyle w:val="PreformattedText"/>
-        <w:bidi w:val="0"/>
-        <w:spacing w:before="0" w:after="0"/>
-        <w:jc w:val="left"/>
-        <w:rPr>
-          <w:rStyle w:val="SourceText"/>
-          <w:color w:val="C9211E"/>
-          <w:sz w:val="20"/>
-          <w:szCs w:val="20"/>
-        </w:rPr>
-      </w:pPr>
-      <w:r>
-        <w:rPr>
-          <w:color w:val="C9211E"/>
-          <w:sz w:val="20"/>
-          <w:szCs w:val="20"/>
-        </w:rPr>
-      </w:r>
-    </w:p>
-    <w:p>
-      <w:pPr>
-        <w:pStyle w:val="PreformattedText"/>
-        <w:bidi w:val="0"/>
-        <w:spacing w:before="0" w:after="0"/>
-        <w:jc w:val="left"/>
-        <w:rPr>
-          <w:rStyle w:val="SourceText"/>
-          <w:color w:val="C9211E"/>
-          <w:sz w:val="20"/>
-          <w:szCs w:val="20"/>
-        </w:rPr>
-      </w:pPr>
-      <w:r>
-        <w:rPr>
-          <w:color w:val="C9211E"/>
-          <w:sz w:val="20"/>
-          <w:szCs w:val="20"/>
-        </w:rPr>
-      </w:r>
-    </w:p>
-    <w:p>
-      <w:pPr>
-        <w:pStyle w:val="PreformattedText"/>
-        <w:bidi w:val="0"/>
-        <w:spacing w:before="0" w:after="0"/>
-        <w:jc w:val="left"/>
-        <w:rPr>
-          <w:rStyle w:val="SourceText"/>
-          <w:color w:val="C9211E"/>
-          <w:kern w:val="2"/>
-          <w:sz w:val="20"/>
-          <w:szCs w:val="20"/>
-          <w:lang w:val="en-US" w:eastAsia="zh-CN" w:bidi="hi-IN"/>
-        </w:rPr>
-      </w:pPr>
-      <w:r>
-        <w:rPr>
-          <w:color w:val="C9211E"/>
-          <w:kern w:val="2"/>
-          <w:sz w:val="20"/>
-          <w:szCs w:val="20"/>
-          <w:lang w:val="en-US" w:eastAsia="zh-CN" w:bidi="hi-IN"/>
-        </w:rPr>
-      </w:r>
-    </w:p>
-    <w:p>
-      <w:pPr>
-        <w:pStyle w:val="PreformattedText"/>
-        <w:bidi w:val="0"/>
-        <w:spacing w:before="0" w:after="0"/>
-        <w:jc w:val="left"/>
-        <w:rPr>
-          <w:rStyle w:val="SourceText"/>
-          <w:color w:val="auto"/>
-          <w:kern w:val="2"/>
-          <w:sz w:val="20"/>
-          <w:szCs w:val="20"/>
-        </w:rPr>
-      </w:pPr>
-      <w:r>
-        <w:rPr>
-          <w:color w:val="auto"/>
-          <w:kern w:val="2"/>
-          <w:sz w:val="20"/>
-          <w:szCs w:val="20"/>
-        </w:rPr>
-      </w:r>
-    </w:p>
-    <w:p>
-      <w:pPr>
-        <w:pStyle w:val="PreformattedText"/>
-        <w:bidi w:val="0"/>
-        <w:spacing w:before="0" w:after="0"/>
-        <w:jc w:val="left"/>
-        <w:rPr>
-          <w:rStyle w:val="SourceText"/>
-        </w:rPr>
-      </w:pPr>
-      <w:r>
-        <w:rPr/>
-      </w:r>
-    </w:p>
-    <w:p>
-      <w:pPr>
-        <w:pStyle w:val="Normal"/>
-        <w:bidi w:val="0"/>
-        <w:spacing w:before="0" w:after="0"/>
-        <w:jc w:val="left"/>
-        <w:rPr/>
-      </w:pPr>
-      <w:r>
-        <w:rPr/>
       </w:r>
     </w:p>
     <w:sectPr>

</xml_diff>